<commit_message>
fix: ДСТУ compliance — pageBreakBefore, remove unused PageBreak import
</commit_message>
<xml_diff>
--- a/reports/lr3/Звіт_ЛР3_Коновалов_ПЗПІ-25-6.docx
+++ b/reports/lr3/Звіт_ЛР3_Коновалов_ПЗПІ-25-6.docx
@@ -435,14 +435,10 @@
       </w:r>
     </w:p>
     <w:p>
-      <w:r>
-        <w:br w:type="page"/>
-      </w:r>
-    </w:p>
-    <w:p>
       <w:pPr>
         <w:pStyle w:val="Heading1"/>
         <w:keepNext/>
+        <w:pageBreakBefore/>
         <w:spacing w:after="120" w:before="240" w:line="360" w:lineRule="auto"/>
       </w:pPr>
       <w:r>

</xml_diff>